<commit_message>
Standards - 2/16/2026 part 1
</commit_message>
<xml_diff>
--- a/1-Information/Entertainment/1-Basics/1-Entertainment.docx.docx
+++ b/1-Information/Entertainment/1-Basics/1-Entertainment.docx.docx
@@ -34,7 +34,6 @@
       </w:pPr>
       <w:r>
         <w:rPr>
-          <w:rFonts w:ascii="Arial" w:hAnsi="Arial" w:eastAsia="Arial"/>
           <w:b/>
           <w:color w:val="000000"/>
           <w:sz w:val="18"/>
@@ -44,27 +43,22 @@
       </w:r>
       <w:r>
         <w:rPr>
-          <w:rFonts w:ascii="Arial" w:hAnsi="Arial" w:eastAsia="Arial"/>
           <w:color w:val="000000"/>
           <w:sz w:val="18"/>
           <w:highlight w:val="lightGray"/>
         </w:rPr>
         <w:t xml:space="preserve">: Persons Table -&gt; ID Column: 1, </w:t>
       </w:r>
-      <w:proofErr w:type="spellStart"/>
-      <w:r>
-        <w:rPr>
-          <w:rFonts w:ascii="Arial" w:hAnsi="Arial" w:eastAsia="Arial"/>
+      <w:r>
+        <w:rPr>
           <w:color w:val="000000"/>
           <w:sz w:val="18"/>
           <w:highlight w:val="lightGray"/>
         </w:rPr>
         <w:t>Name_En</w:t>
       </w:r>
-      <w:proofErr w:type="spellEnd"/>
-      <w:r>
-        <w:rPr>
-          <w:rFonts w:ascii="Arial" w:hAnsi="Arial" w:eastAsia="Arial"/>
+      <w:r>
+        <w:rPr>
           <w:color w:val="000000"/>
           <w:sz w:val="18"/>
           <w:highlight w:val="lightGray"/>
@@ -73,7 +67,6 @@
       </w:r>
       <w:r>
         <w:rPr>
-          <w:rFonts w:ascii="Arial" w:hAnsi="Arial" w:eastAsia="Arial"/>
           <w:b/>
           <w:color w:val="000000"/>
           <w:sz w:val="18"/>
@@ -83,54 +76,99 @@
       </w:r>
       <w:r>
         <w:rPr>
-          <w:rFonts w:ascii="Arial" w:hAnsi="Arial" w:eastAsia="Arial"/>
           <w:color w:val="000000"/>
           <w:sz w:val="18"/>
           <w:highlight w:val="lightGray"/>
         </w:rPr>
         <w:t xml:space="preserve"> [</w:t>
       </w:r>
-      <w:proofErr w:type="spellStart"/>
-      <w:r>
-        <w:rPr>
-          <w:rFonts w:ascii="Arial" w:hAnsi="Arial" w:eastAsia="Arial"/>
-          <w:color w:val="000000"/>
-          <w:sz w:val="18"/>
-          <w:highlight w:val="lightGray"/>
-        </w:rPr>
-        <w:t>Chatgpt</w:t>
-      </w:r>
-      <w:proofErr w:type="spellEnd"/>
-      <w:r>
-        <w:rPr>
-          <w:rFonts w:ascii="Arial" w:hAnsi="Arial" w:eastAsia="Arial"/>
-          <w:color w:val="000000"/>
-          <w:sz w:val="18"/>
-          <w:highlight w:val="lightGray"/>
-        </w:rPr>
-        <w:t xml:space="preserve"> (GPT</w:t>
-      </w:r>
-      <w:r>
-        <w:rPr>
-          <w:rFonts w:ascii="Arial" w:eastAsia="Arial" w:hAnsi="Arial" w:cs="Cambria Math"/>
-          <w:color w:val="000000"/>
-          <w:sz w:val="18"/>
-          <w:highlight w:val="lightGray"/>
-        </w:rPr>
-        <w:t>‑</w:t>
-      </w:r>
-      <w:r>
-        <w:rPr>
-          <w:rFonts w:ascii="Arial" w:hAnsi="Arial" w:eastAsia="Arial"/>
-          <w:color w:val="000000"/>
-          <w:sz w:val="18"/>
-          <w:highlight w:val="lightGray"/>
-        </w:rPr>
-        <w:t xml:space="preserve">5 Mini)] </w:t>
-      </w:r>
-      <w:r>
-        <w:rPr>
-          <w:rFonts w:ascii="Arial" w:hAnsi="Arial" w:eastAsia="Arial"/>
+      <w:r>
+        <w:rPr>
+          <w:rFonts w:ascii="Arial" w:hAnsi="Arial" w:eastAsia="Arial" w:cs="Arial"/>
+          <w:b w:val="0"/>
+          <w:i w:val="0"/>
+          <w:color w:val="000000"/>
+          <w:sz w:val="18"/>
+          <w:highlight w:val="lightGray"/>
+        </w:rPr>
+        <w:t>C</w:t>
+      </w:r>
+      <w:r>
+        <w:rPr>
+          <w:rFonts w:ascii="Arial" w:hAnsi="Arial" w:eastAsia="Arial" w:cs="Arial"/>
+          <w:b w:val="0"/>
+          <w:i w:val="0"/>
+          <w:color w:val="000000"/>
+          <w:sz w:val="18"/>
+          <w:highlight w:val="lightGray"/>
+        </w:rPr>
+        <w:t>h</w:t>
+      </w:r>
+      <w:r>
+        <w:rPr>
+          <w:rFonts w:ascii="Arial" w:hAnsi="Arial" w:eastAsia="Arial" w:cs="Arial"/>
+          <w:b w:val="0"/>
+          <w:i w:val="0"/>
+          <w:color w:val="000000"/>
+          <w:sz w:val="18"/>
+          <w:highlight w:val="lightGray"/>
+        </w:rPr>
+        <w:t>a</w:t>
+      </w:r>
+      <w:r>
+        <w:rPr>
+          <w:rFonts w:ascii="Arial" w:hAnsi="Arial" w:eastAsia="Arial" w:cs="Arial"/>
+          <w:b w:val="0"/>
+          <w:i w:val="0"/>
+          <w:color w:val="000000"/>
+          <w:sz w:val="18"/>
+          <w:highlight w:val="lightGray"/>
+        </w:rPr>
+        <w:t>t</w:t>
+      </w:r>
+      <w:r>
+        <w:rPr>
+          <w:rFonts w:ascii="Arial" w:hAnsi="Arial" w:eastAsia="Arial" w:cs="Arial"/>
+          <w:b w:val="0"/>
+          <w:i w:val="0"/>
+          <w:color w:val="000000"/>
+          <w:sz w:val="18"/>
+          <w:highlight w:val="lightGray"/>
+        </w:rPr>
+        <w:t>G</w:t>
+      </w:r>
+      <w:r>
+        <w:rPr>
+          <w:rFonts w:ascii="Arial" w:hAnsi="Arial" w:eastAsia="Arial" w:cs="Arial"/>
+          <w:b w:val="0"/>
+          <w:i w:val="0"/>
+          <w:color w:val="000000"/>
+          <w:sz w:val="18"/>
+          <w:highlight w:val="lightGray"/>
+        </w:rPr>
+        <w:t>P</w:t>
+      </w:r>
+      <w:r>
+        <w:rPr>
+          <w:rFonts w:ascii="Arial" w:hAnsi="Arial" w:eastAsia="Arial" w:cs="Arial"/>
+          <w:b w:val="0"/>
+          <w:i w:val="0"/>
+          <w:color w:val="000000"/>
+          <w:sz w:val="18"/>
+          <w:highlight w:val="lightGray"/>
+        </w:rPr>
+        <w:t>T</w:t>
+      </w:r>
+      <w:r>
+        <w:rPr>
+          <w:color w:val="000000"/>
+          <w:sz w:val="18"/>
+          <w:highlight w:val="lightGray"/>
+        </w:rPr>
+        <w:t xml:space="preserve">] </w:t>
+      </w:r>
+      <w:r>
+        <w:rPr>
           <w:b/>
           <w:color w:val="000000"/>
           <w:sz w:val="18"/>
@@ -140,7 +178,6 @@
       </w:r>
       <w:r>
         <w:rPr>
-          <w:rFonts w:ascii="Arial" w:hAnsi="Arial" w:eastAsia="Arial"/>
           <w:sz w:val="18"/>
           <w:highlight w:val="lightGray"/>
         </w:rPr>
@@ -222,7 +259,6 @@
       </w:pPr>
       <w:r>
         <w:rPr>
-          <w:rFonts w:ascii="Arial" w:hAnsi="Arial" w:eastAsia="Arial"/>
           <w:b/>
           <w:color w:val="000000"/>
           <w:sz w:val="18"/>
@@ -232,27 +268,22 @@
       </w:r>
       <w:r>
         <w:rPr>
-          <w:rFonts w:ascii="Arial" w:hAnsi="Arial" w:eastAsia="Arial"/>
           <w:color w:val="000000"/>
           <w:sz w:val="18"/>
           <w:highlight w:val="lightGray"/>
         </w:rPr>
         <w:t xml:space="preserve">: Persons Table -&gt; ID Column: 1, </w:t>
       </w:r>
-      <w:proofErr w:type="spellStart"/>
-      <w:r>
-        <w:rPr>
-          <w:rFonts w:ascii="Arial" w:hAnsi="Arial" w:eastAsia="Arial"/>
+      <w:r>
+        <w:rPr>
           <w:color w:val="000000"/>
           <w:sz w:val="18"/>
           <w:highlight w:val="lightGray"/>
         </w:rPr>
         <w:t>Name_En</w:t>
       </w:r>
-      <w:proofErr w:type="spellEnd"/>
-      <w:r>
-        <w:rPr>
-          <w:rFonts w:ascii="Arial" w:hAnsi="Arial" w:eastAsia="Arial"/>
+      <w:r>
+        <w:rPr>
           <w:color w:val="000000"/>
           <w:sz w:val="18"/>
           <w:highlight w:val="lightGray"/>
@@ -261,7 +292,6 @@
       </w:r>
       <w:r>
         <w:rPr>
-          <w:rFonts w:ascii="Arial" w:hAnsi="Arial" w:eastAsia="Arial"/>
           <w:b/>
           <w:color w:val="000000"/>
           <w:sz w:val="18"/>
@@ -271,54 +301,99 @@
       </w:r>
       <w:r>
         <w:rPr>
-          <w:rFonts w:ascii="Arial" w:hAnsi="Arial" w:eastAsia="Arial"/>
           <w:color w:val="000000"/>
           <w:sz w:val="18"/>
           <w:highlight w:val="lightGray"/>
         </w:rPr>
         <w:t xml:space="preserve"> [</w:t>
       </w:r>
-      <w:proofErr w:type="spellStart"/>
-      <w:r>
-        <w:rPr>
-          <w:rFonts w:ascii="Arial" w:hAnsi="Arial" w:eastAsia="Arial"/>
-          <w:color w:val="000000"/>
-          <w:sz w:val="18"/>
-          <w:highlight w:val="lightGray"/>
-        </w:rPr>
-        <w:t>Chatgpt</w:t>
-      </w:r>
-      <w:proofErr w:type="spellEnd"/>
-      <w:r>
-        <w:rPr>
-          <w:rFonts w:ascii="Arial" w:hAnsi="Arial" w:eastAsia="Arial"/>
-          <w:color w:val="000000"/>
-          <w:sz w:val="18"/>
-          <w:highlight w:val="lightGray"/>
-        </w:rPr>
-        <w:t xml:space="preserve"> (GPT</w:t>
-      </w:r>
-      <w:r>
-        <w:rPr>
-          <w:rFonts w:ascii="Arial" w:eastAsia="Arial" w:hAnsi="Arial" w:cs="Cambria Math"/>
-          <w:color w:val="000000"/>
-          <w:sz w:val="18"/>
-          <w:highlight w:val="lightGray"/>
-        </w:rPr>
-        <w:t>‑</w:t>
-      </w:r>
-      <w:r>
-        <w:rPr>
-          <w:rFonts w:ascii="Arial" w:hAnsi="Arial" w:eastAsia="Arial"/>
-          <w:color w:val="000000"/>
-          <w:sz w:val="18"/>
-          <w:highlight w:val="lightGray"/>
-        </w:rPr>
-        <w:t xml:space="preserve">5 Mini)] </w:t>
-      </w:r>
-      <w:r>
-        <w:rPr>
-          <w:rFonts w:ascii="Arial" w:hAnsi="Arial" w:eastAsia="Arial"/>
+      <w:r>
+        <w:rPr>
+          <w:rFonts w:ascii="Arial" w:hAnsi="Arial" w:eastAsia="Arial" w:cs="Arial"/>
+          <w:b w:val="0"/>
+          <w:i w:val="0"/>
+          <w:color w:val="000000"/>
+          <w:sz w:val="18"/>
+          <w:highlight w:val="lightGray"/>
+        </w:rPr>
+        <w:t>C</w:t>
+      </w:r>
+      <w:r>
+        <w:rPr>
+          <w:rFonts w:ascii="Arial" w:hAnsi="Arial" w:eastAsia="Arial" w:cs="Arial"/>
+          <w:b w:val="0"/>
+          <w:i w:val="0"/>
+          <w:color w:val="000000"/>
+          <w:sz w:val="18"/>
+          <w:highlight w:val="lightGray"/>
+        </w:rPr>
+        <w:t>h</w:t>
+      </w:r>
+      <w:r>
+        <w:rPr>
+          <w:rFonts w:ascii="Arial" w:hAnsi="Arial" w:eastAsia="Arial" w:cs="Arial"/>
+          <w:b w:val="0"/>
+          <w:i w:val="0"/>
+          <w:color w:val="000000"/>
+          <w:sz w:val="18"/>
+          <w:highlight w:val="lightGray"/>
+        </w:rPr>
+        <w:t>a</w:t>
+      </w:r>
+      <w:r>
+        <w:rPr>
+          <w:rFonts w:ascii="Arial" w:hAnsi="Arial" w:eastAsia="Arial" w:cs="Arial"/>
+          <w:b w:val="0"/>
+          <w:i w:val="0"/>
+          <w:color w:val="000000"/>
+          <w:sz w:val="18"/>
+          <w:highlight w:val="lightGray"/>
+        </w:rPr>
+        <w:t>t</w:t>
+      </w:r>
+      <w:r>
+        <w:rPr>
+          <w:rFonts w:ascii="Arial" w:hAnsi="Arial" w:eastAsia="Arial" w:cs="Arial"/>
+          <w:b w:val="0"/>
+          <w:i w:val="0"/>
+          <w:color w:val="000000"/>
+          <w:sz w:val="18"/>
+          <w:highlight w:val="lightGray"/>
+        </w:rPr>
+        <w:t>G</w:t>
+      </w:r>
+      <w:r>
+        <w:rPr>
+          <w:rFonts w:ascii="Arial" w:hAnsi="Arial" w:eastAsia="Arial" w:cs="Arial"/>
+          <w:b w:val="0"/>
+          <w:i w:val="0"/>
+          <w:color w:val="000000"/>
+          <w:sz w:val="18"/>
+          <w:highlight w:val="lightGray"/>
+        </w:rPr>
+        <w:t>P</w:t>
+      </w:r>
+      <w:r>
+        <w:rPr>
+          <w:rFonts w:ascii="Arial" w:hAnsi="Arial" w:eastAsia="Arial" w:cs="Arial"/>
+          <w:b w:val="0"/>
+          <w:i w:val="0"/>
+          <w:color w:val="000000"/>
+          <w:sz w:val="18"/>
+          <w:highlight w:val="lightGray"/>
+        </w:rPr>
+        <w:t>T</w:t>
+      </w:r>
+      <w:r>
+        <w:rPr>
+          <w:color w:val="000000"/>
+          <w:sz w:val="18"/>
+          <w:highlight w:val="lightGray"/>
+        </w:rPr>
+        <w:t xml:space="preserve">] </w:t>
+      </w:r>
+      <w:r>
+        <w:rPr>
           <w:b/>
           <w:color w:val="000000"/>
           <w:sz w:val="18"/>
@@ -328,7 +403,6 @@
       </w:r>
       <w:r>
         <w:rPr>
-          <w:rFonts w:ascii="Arial" w:hAnsi="Arial" w:eastAsia="Arial"/>
           <w:sz w:val="18"/>
           <w:highlight w:val="lightGray"/>
         </w:rPr>
@@ -482,7 +556,6 @@
       </w:pPr>
       <w:r>
         <w:rPr>
-          <w:rFonts w:ascii="Arial" w:hAnsi="Arial" w:eastAsia="Arial"/>
           <w:b/>
           <w:color w:val="000000"/>
           <w:sz w:val="18"/>
@@ -492,27 +565,22 @@
       </w:r>
       <w:r>
         <w:rPr>
-          <w:rFonts w:ascii="Arial" w:hAnsi="Arial" w:eastAsia="Arial"/>
           <w:color w:val="000000"/>
           <w:sz w:val="18"/>
           <w:highlight w:val="lightGray"/>
         </w:rPr>
         <w:t xml:space="preserve">: Persons Table -&gt; ID Column: 1, </w:t>
       </w:r>
-      <w:proofErr w:type="spellStart"/>
-      <w:r>
-        <w:rPr>
-          <w:rFonts w:ascii="Arial" w:hAnsi="Arial" w:eastAsia="Arial"/>
+      <w:r>
+        <w:rPr>
           <w:color w:val="000000"/>
           <w:sz w:val="18"/>
           <w:highlight w:val="lightGray"/>
         </w:rPr>
         <w:t>Name_En</w:t>
       </w:r>
-      <w:proofErr w:type="spellEnd"/>
-      <w:r>
-        <w:rPr>
-          <w:rFonts w:ascii="Arial" w:hAnsi="Arial" w:eastAsia="Arial"/>
+      <w:r>
+        <w:rPr>
           <w:color w:val="000000"/>
           <w:sz w:val="18"/>
           <w:highlight w:val="lightGray"/>
@@ -521,7 +589,6 @@
       </w:r>
       <w:r>
         <w:rPr>
-          <w:rFonts w:ascii="Arial" w:hAnsi="Arial" w:eastAsia="Arial"/>
           <w:b/>
           <w:color w:val="000000"/>
           <w:sz w:val="18"/>
@@ -531,54 +598,99 @@
       </w:r>
       <w:r>
         <w:rPr>
-          <w:rFonts w:ascii="Arial" w:hAnsi="Arial" w:eastAsia="Arial"/>
           <w:color w:val="000000"/>
           <w:sz w:val="18"/>
           <w:highlight w:val="lightGray"/>
         </w:rPr>
         <w:t xml:space="preserve"> [</w:t>
       </w:r>
-      <w:proofErr w:type="spellStart"/>
-      <w:r>
-        <w:rPr>
-          <w:rFonts w:ascii="Arial" w:hAnsi="Arial" w:eastAsia="Arial"/>
-          <w:color w:val="000000"/>
-          <w:sz w:val="18"/>
-          <w:highlight w:val="lightGray"/>
-        </w:rPr>
-        <w:t>Chatgpt</w:t>
-      </w:r>
-      <w:proofErr w:type="spellEnd"/>
-      <w:r>
-        <w:rPr>
-          <w:rFonts w:ascii="Arial" w:hAnsi="Arial" w:eastAsia="Arial"/>
-          <w:color w:val="000000"/>
-          <w:sz w:val="18"/>
-          <w:highlight w:val="lightGray"/>
-        </w:rPr>
-        <w:t xml:space="preserve"> (GPT</w:t>
-      </w:r>
-      <w:r>
-        <w:rPr>
-          <w:rFonts w:ascii="Arial" w:eastAsia="Arial" w:hAnsi="Arial" w:cs="Cambria Math"/>
-          <w:color w:val="000000"/>
-          <w:sz w:val="18"/>
-          <w:highlight w:val="lightGray"/>
-        </w:rPr>
-        <w:t>‑</w:t>
-      </w:r>
-      <w:r>
-        <w:rPr>
-          <w:rFonts w:ascii="Arial" w:hAnsi="Arial" w:eastAsia="Arial"/>
-          <w:color w:val="000000"/>
-          <w:sz w:val="18"/>
-          <w:highlight w:val="lightGray"/>
-        </w:rPr>
-        <w:t xml:space="preserve">5 Mini)] </w:t>
-      </w:r>
-      <w:r>
-        <w:rPr>
-          <w:rFonts w:ascii="Arial" w:hAnsi="Arial" w:eastAsia="Arial"/>
+      <w:r>
+        <w:rPr>
+          <w:rFonts w:ascii="Arial" w:hAnsi="Arial" w:eastAsia="Arial" w:cs="Arial"/>
+          <w:b w:val="0"/>
+          <w:i w:val="0"/>
+          <w:color w:val="000000"/>
+          <w:sz w:val="18"/>
+          <w:highlight w:val="lightGray"/>
+        </w:rPr>
+        <w:t>C</w:t>
+      </w:r>
+      <w:r>
+        <w:rPr>
+          <w:rFonts w:ascii="Arial" w:hAnsi="Arial" w:eastAsia="Arial" w:cs="Arial"/>
+          <w:b w:val="0"/>
+          <w:i w:val="0"/>
+          <w:color w:val="000000"/>
+          <w:sz w:val="18"/>
+          <w:highlight w:val="lightGray"/>
+        </w:rPr>
+        <w:t>h</w:t>
+      </w:r>
+      <w:r>
+        <w:rPr>
+          <w:rFonts w:ascii="Arial" w:hAnsi="Arial" w:eastAsia="Arial" w:cs="Arial"/>
+          <w:b w:val="0"/>
+          <w:i w:val="0"/>
+          <w:color w:val="000000"/>
+          <w:sz w:val="18"/>
+          <w:highlight w:val="lightGray"/>
+        </w:rPr>
+        <w:t>a</w:t>
+      </w:r>
+      <w:r>
+        <w:rPr>
+          <w:rFonts w:ascii="Arial" w:hAnsi="Arial" w:eastAsia="Arial" w:cs="Arial"/>
+          <w:b w:val="0"/>
+          <w:i w:val="0"/>
+          <w:color w:val="000000"/>
+          <w:sz w:val="18"/>
+          <w:highlight w:val="lightGray"/>
+        </w:rPr>
+        <w:t>t</w:t>
+      </w:r>
+      <w:r>
+        <w:rPr>
+          <w:rFonts w:ascii="Arial" w:hAnsi="Arial" w:eastAsia="Arial" w:cs="Arial"/>
+          <w:b w:val="0"/>
+          <w:i w:val="0"/>
+          <w:color w:val="000000"/>
+          <w:sz w:val="18"/>
+          <w:highlight w:val="lightGray"/>
+        </w:rPr>
+        <w:t>G</w:t>
+      </w:r>
+      <w:r>
+        <w:rPr>
+          <w:rFonts w:ascii="Arial" w:hAnsi="Arial" w:eastAsia="Arial" w:cs="Arial"/>
+          <w:b w:val="0"/>
+          <w:i w:val="0"/>
+          <w:color w:val="000000"/>
+          <w:sz w:val="18"/>
+          <w:highlight w:val="lightGray"/>
+        </w:rPr>
+        <w:t>P</w:t>
+      </w:r>
+      <w:r>
+        <w:rPr>
+          <w:rFonts w:ascii="Arial" w:hAnsi="Arial" w:eastAsia="Arial" w:cs="Arial"/>
+          <w:b w:val="0"/>
+          <w:i w:val="0"/>
+          <w:color w:val="000000"/>
+          <w:sz w:val="18"/>
+          <w:highlight w:val="lightGray"/>
+        </w:rPr>
+        <w:t>T</w:t>
+      </w:r>
+      <w:r>
+        <w:rPr>
+          <w:color w:val="000000"/>
+          <w:sz w:val="18"/>
+          <w:highlight w:val="lightGray"/>
+        </w:rPr>
+        <w:t xml:space="preserve">] </w:t>
+      </w:r>
+      <w:r>
+        <w:rPr>
           <w:b/>
           <w:color w:val="000000"/>
           <w:sz w:val="18"/>
@@ -588,7 +700,6 @@
       </w:r>
       <w:r>
         <w:rPr>
-          <w:rFonts w:ascii="Arial" w:hAnsi="Arial" w:eastAsia="Arial"/>
           <w:sz w:val="18"/>
           <w:highlight w:val="lightGray"/>
         </w:rPr>
@@ -771,7 +882,6 @@
       </w:pPr>
       <w:r>
         <w:rPr>
-          <w:rFonts w:ascii="Arial" w:hAnsi="Arial" w:eastAsia="Arial"/>
           <w:b/>
           <w:color w:val="000000"/>
           <w:sz w:val="18"/>
@@ -781,27 +891,22 @@
       </w:r>
       <w:r>
         <w:rPr>
-          <w:rFonts w:ascii="Arial" w:hAnsi="Arial" w:eastAsia="Arial"/>
           <w:color w:val="000000"/>
           <w:sz w:val="18"/>
           <w:highlight w:val="lightGray"/>
         </w:rPr>
         <w:t xml:space="preserve">: Persons Table -&gt; ID Column: 1, </w:t>
       </w:r>
-      <w:proofErr w:type="spellStart"/>
-      <w:r>
-        <w:rPr>
-          <w:rFonts w:ascii="Arial" w:hAnsi="Arial" w:eastAsia="Arial"/>
+      <w:r>
+        <w:rPr>
           <w:color w:val="000000"/>
           <w:sz w:val="18"/>
           <w:highlight w:val="lightGray"/>
         </w:rPr>
         <w:t>Name_En</w:t>
       </w:r>
-      <w:proofErr w:type="spellEnd"/>
-      <w:r>
-        <w:rPr>
-          <w:rFonts w:ascii="Arial" w:hAnsi="Arial" w:eastAsia="Arial"/>
+      <w:r>
+        <w:rPr>
           <w:color w:val="000000"/>
           <w:sz w:val="18"/>
           <w:highlight w:val="lightGray"/>
@@ -810,7 +915,6 @@
       </w:r>
       <w:r>
         <w:rPr>
-          <w:rFonts w:ascii="Arial" w:hAnsi="Arial" w:eastAsia="Arial"/>
           <w:b/>
           <w:color w:val="000000"/>
           <w:sz w:val="18"/>
@@ -820,54 +924,99 @@
       </w:r>
       <w:r>
         <w:rPr>
-          <w:rFonts w:ascii="Arial" w:hAnsi="Arial" w:eastAsia="Arial"/>
           <w:color w:val="000000"/>
           <w:sz w:val="18"/>
           <w:highlight w:val="lightGray"/>
         </w:rPr>
         <w:t xml:space="preserve"> [</w:t>
       </w:r>
-      <w:proofErr w:type="spellStart"/>
-      <w:r>
-        <w:rPr>
-          <w:rFonts w:ascii="Arial" w:hAnsi="Arial" w:eastAsia="Arial"/>
-          <w:color w:val="000000"/>
-          <w:sz w:val="18"/>
-          <w:highlight w:val="lightGray"/>
-        </w:rPr>
-        <w:t>Chatgpt</w:t>
-      </w:r>
-      <w:proofErr w:type="spellEnd"/>
-      <w:r>
-        <w:rPr>
-          <w:rFonts w:ascii="Arial" w:hAnsi="Arial" w:eastAsia="Arial"/>
-          <w:color w:val="000000"/>
-          <w:sz w:val="18"/>
-          <w:highlight w:val="lightGray"/>
-        </w:rPr>
-        <w:t xml:space="preserve"> (GPT</w:t>
-      </w:r>
-      <w:r>
-        <w:rPr>
-          <w:rFonts w:ascii="Arial" w:eastAsia="Arial" w:hAnsi="Arial" w:cs="Cambria Math"/>
-          <w:color w:val="000000"/>
-          <w:sz w:val="18"/>
-          <w:highlight w:val="lightGray"/>
-        </w:rPr>
-        <w:t>‑</w:t>
-      </w:r>
-      <w:r>
-        <w:rPr>
-          <w:rFonts w:ascii="Arial" w:hAnsi="Arial" w:eastAsia="Arial"/>
-          <w:color w:val="000000"/>
-          <w:sz w:val="18"/>
-          <w:highlight w:val="lightGray"/>
-        </w:rPr>
-        <w:t xml:space="preserve">5 Mini)] </w:t>
-      </w:r>
-      <w:r>
-        <w:rPr>
-          <w:rFonts w:ascii="Arial" w:hAnsi="Arial" w:eastAsia="Arial"/>
+      <w:r>
+        <w:rPr>
+          <w:rFonts w:ascii="Arial" w:hAnsi="Arial" w:eastAsia="Arial" w:cs="Arial"/>
+          <w:b w:val="0"/>
+          <w:i w:val="0"/>
+          <w:color w:val="000000"/>
+          <w:sz w:val="18"/>
+          <w:highlight w:val="lightGray"/>
+        </w:rPr>
+        <w:t>C</w:t>
+      </w:r>
+      <w:r>
+        <w:rPr>
+          <w:rFonts w:ascii="Arial" w:hAnsi="Arial" w:eastAsia="Arial" w:cs="Arial"/>
+          <w:b w:val="0"/>
+          <w:i w:val="0"/>
+          <w:color w:val="000000"/>
+          <w:sz w:val="18"/>
+          <w:highlight w:val="lightGray"/>
+        </w:rPr>
+        <w:t>h</w:t>
+      </w:r>
+      <w:r>
+        <w:rPr>
+          <w:rFonts w:ascii="Arial" w:hAnsi="Arial" w:eastAsia="Arial" w:cs="Arial"/>
+          <w:b w:val="0"/>
+          <w:i w:val="0"/>
+          <w:color w:val="000000"/>
+          <w:sz w:val="18"/>
+          <w:highlight w:val="lightGray"/>
+        </w:rPr>
+        <w:t>a</w:t>
+      </w:r>
+      <w:r>
+        <w:rPr>
+          <w:rFonts w:ascii="Arial" w:hAnsi="Arial" w:eastAsia="Arial" w:cs="Arial"/>
+          <w:b w:val="0"/>
+          <w:i w:val="0"/>
+          <w:color w:val="000000"/>
+          <w:sz w:val="18"/>
+          <w:highlight w:val="lightGray"/>
+        </w:rPr>
+        <w:t>t</w:t>
+      </w:r>
+      <w:r>
+        <w:rPr>
+          <w:rFonts w:ascii="Arial" w:hAnsi="Arial" w:eastAsia="Arial" w:cs="Arial"/>
+          <w:b w:val="0"/>
+          <w:i w:val="0"/>
+          <w:color w:val="000000"/>
+          <w:sz w:val="18"/>
+          <w:highlight w:val="lightGray"/>
+        </w:rPr>
+        <w:t>G</w:t>
+      </w:r>
+      <w:r>
+        <w:rPr>
+          <w:rFonts w:ascii="Arial" w:hAnsi="Arial" w:eastAsia="Arial" w:cs="Arial"/>
+          <w:b w:val="0"/>
+          <w:i w:val="0"/>
+          <w:color w:val="000000"/>
+          <w:sz w:val="18"/>
+          <w:highlight w:val="lightGray"/>
+        </w:rPr>
+        <w:t>P</w:t>
+      </w:r>
+      <w:r>
+        <w:rPr>
+          <w:rFonts w:ascii="Arial" w:hAnsi="Arial" w:eastAsia="Arial" w:cs="Arial"/>
+          <w:b w:val="0"/>
+          <w:i w:val="0"/>
+          <w:color w:val="000000"/>
+          <w:sz w:val="18"/>
+          <w:highlight w:val="lightGray"/>
+        </w:rPr>
+        <w:t>T</w:t>
+      </w:r>
+      <w:r>
+        <w:rPr>
+          <w:color w:val="000000"/>
+          <w:sz w:val="18"/>
+          <w:highlight w:val="lightGray"/>
+        </w:rPr>
+        <w:t xml:space="preserve">] </w:t>
+      </w:r>
+      <w:r>
+        <w:rPr>
           <w:b/>
           <w:color w:val="000000"/>
           <w:sz w:val="18"/>
@@ -877,7 +1026,6 @@
       </w:r>
       <w:r>
         <w:rPr>
-          <w:rFonts w:ascii="Arial" w:hAnsi="Arial" w:eastAsia="Arial"/>
           <w:sz w:val="18"/>
           <w:highlight w:val="lightGray"/>
         </w:rPr>

</xml_diff>